<commit_message>
Point project links at the public repository
The report and README should open the published GitHub project.
</commit_message>
<xml_diff>
--- a/docs/Отчет_практика_Trello_Clone.docx
+++ b/docs/Отчет_практика_Trello_Clone.docx
@@ -59,7 +59,7 @@
           <w:color w:val="17324D"/>
           <w:sz w:val="28"/>
         </w:rPr>
-        <w:t>GitHub: evilghost2436</w:t>
+        <w:t>GitHub: Daniil9452</w:t>
       </w:r>
     </w:p>
     <w:p>
@@ -296,7 +296,7 @@
                 <w:color w:val="17324D"/>
                 <w:sz w:val="22"/>
               </w:rPr>
-              <w:t>https://github.com/evilghost2436/trello-clone</w:t>
+              <w:t>https://github.com/Daniil9452/trello-clone</w:t>
             </w:r>
           </w:p>
         </w:tc>
@@ -1887,9 +1887,9 @@
                 <w:color w:val="17324D"/>
                 <w:sz w:val="22"/>
               </w:rPr>
-              <w:t>https://github.com/evilghost2436/trello-clone/blob/main/frontend/src/components/SignUp.js</w:t>
+              <w:t>https://github.com/Daniil9452/trello-clone/blob/main/frontend/src/components/SignUp.js</w:t>
               <w:br/>
-              <w:t>https://github.com/evilghost2436/trello-clone/blob/main/lib/doski/accounts.ex</w:t>
+              <w:t>https://github.com/Daniil9452/trello-clone/blob/main/lib/doski/accounts.ex</w:t>
             </w:r>
           </w:p>
         </w:tc>
@@ -1942,9 +1942,9 @@
                 <w:color w:val="17324D"/>
                 <w:sz w:val="22"/>
               </w:rPr>
-              <w:t>https://github.com/evilghost2436/trello-clone/blob/main/frontend/src/components/SignIn.js</w:t>
+              <w:t>https://github.com/Daniil9452/trello-clone/blob/main/frontend/src/components/SignIn.js</w:t>
               <w:br/>
-              <w:t>https://github.com/evilghost2436/trello-clone/blob/main/lib/doski_web/controllers/session_controller.ex</w:t>
+              <w:t>https://github.com/Daniil9452/trello-clone/blob/main/lib/doski_web/controllers/session_controller.ex</w:t>
             </w:r>
           </w:p>
         </w:tc>
@@ -1997,9 +1997,9 @@
                 <w:color w:val="17324D"/>
                 <w:sz w:val="22"/>
               </w:rPr>
-              <w:t>https://github.com/evilghost2436/trello-clone/blob/main/frontend/src/components/Home.js</w:t>
+              <w:t>https://github.com/Daniil9452/trello-clone/blob/main/frontend/src/components/Home.js</w:t>
               <w:br/>
-              <w:t>https://github.com/evilghost2436/trello-clone/blob/main/lib/doski/boards.ex</w:t>
+              <w:t>https://github.com/Daniil9452/trello-clone/blob/main/lib/doski/boards.ex</w:t>
             </w:r>
           </w:p>
         </w:tc>
@@ -2052,7 +2052,7 @@
                 <w:color w:val="17324D"/>
                 <w:sz w:val="22"/>
               </w:rPr>
-              <w:t>https://github.com/evilghost2436/trello-clone/blob/main/frontend/src/components/Home.js</w:t>
+              <w:t>https://github.com/Daniil9452/trello-clone/blob/main/frontend/src/components/Home.js</w:t>
             </w:r>
           </w:p>
         </w:tc>
@@ -2105,9 +2105,9 @@
                 <w:color w:val="17324D"/>
                 <w:sz w:val="22"/>
               </w:rPr>
-              <w:t>https://github.com/evilghost2436/trello-clone/blob/main/frontend/src/components/BoardView.js</w:t>
+              <w:t>https://github.com/Daniil9452/trello-clone/blob/main/frontend/src/components/BoardView.js</w:t>
               <w:br/>
-              <w:t>https://github.com/evilghost2436/trello-clone/blob/main/frontend/src/components/ListColumn.js</w:t>
+              <w:t>https://github.com/Daniil9452/trello-clone/blob/main/frontend/src/components/ListColumn.js</w:t>
             </w:r>
           </w:p>
         </w:tc>
@@ -2160,9 +2160,9 @@
                 <w:color w:val="17324D"/>
                 <w:sz w:val="22"/>
               </w:rPr>
-              <w:t>https://github.com/evilghost2436/trello-clone/blob/main/frontend/src/components/CardModal.js</w:t>
+              <w:t>https://github.com/Daniil9452/trello-clone/blob/main/frontend/src/components/CardModal.js</w:t>
               <w:br/>
-              <w:t>https://github.com/evilghost2436/trello-clone/blob/main/lib/doski_web/controllers/card_controller.ex</w:t>
+              <w:t>https://github.com/Daniil9452/trello-clone/blob/main/lib/doski_web/controllers/card_controller.ex</w:t>
             </w:r>
           </w:p>
         </w:tc>
@@ -2215,7 +2215,7 @@
                 <w:color w:val="17324D"/>
                 <w:sz w:val="22"/>
               </w:rPr>
-              <w:t>https://github.com/evilghost2436/trello-clone/blob/main/frontend/src/components/ListColumn.js</w:t>
+              <w:t>https://github.com/Daniil9452/trello-clone/blob/main/frontend/src/components/ListColumn.js</w:t>
             </w:r>
           </w:p>
         </w:tc>
@@ -2268,7 +2268,7 @@
                 <w:color w:val="17324D"/>
                 <w:sz w:val="22"/>
               </w:rPr>
-              <w:t>https://github.com/evilghost2436/trello-clone/blob/main/lib/doski_web/controllers/member_controller.ex</w:t>
+              <w:t>https://github.com/Daniil9452/trello-clone/blob/main/lib/doski_web/controllers/member_controller.ex</w:t>
             </w:r>
           </w:p>
         </w:tc>
@@ -2321,7 +2321,7 @@
                 <w:color w:val="17324D"/>
                 <w:sz w:val="22"/>
               </w:rPr>
-              <w:t>https://github.com/evilghost2436/trello-clone/blob/main/lib/doski_web/controllers/board_controller.ex</w:t>
+              <w:t>https://github.com/Daniil9452/trello-clone/blob/main/lib/doski_web/controllers/board_controller.ex</w:t>
             </w:r>
           </w:p>
         </w:tc>
@@ -2374,9 +2374,9 @@
                 <w:color w:val="17324D"/>
                 <w:sz w:val="22"/>
               </w:rPr>
-              <w:t>https://github.com/evilghost2436/trello-clone/blob/main/lib/doski_web/channels/board_channel.ex</w:t>
+              <w:t>https://github.com/Daniil9452/trello-clone/blob/main/lib/doski_web/channels/board_channel.ex</w:t>
               <w:br/>
-              <w:t>https://github.com/evilghost2436/trello-clone/blob/main/frontend/src/socket.js</w:t>
+              <w:t>https://github.com/Daniil9452/trello-clone/blob/main/frontend/src/socket.js</w:t>
             </w:r>
           </w:p>
         </w:tc>
@@ -2429,7 +2429,7 @@
                 <w:color w:val="17324D"/>
                 <w:sz w:val="22"/>
               </w:rPr>
-              <w:t>https://github.com/evilghost2436/trello-clone/blob/main/lib/doski/seeds.ex</w:t>
+              <w:t>https://github.com/Daniil9452/trello-clone/blob/main/lib/doski/seeds.ex</w:t>
             </w:r>
           </w:p>
         </w:tc>
@@ -2756,7 +2756,7 @@
           <w:color w:val="17324D"/>
           <w:sz w:val="28"/>
         </w:rPr>
-        <w:t>В корне лежит .codeclimate.yml: пороги сложности методов, длины файла и вложенности, из анализа исключены deps, _build, node_modules, собранная статика и тесты. В README вставлен бейдж Code Climate репозитория evilghost2436/trello-clone. После того как публичный репозиторий добавлен в Code Climate, бейдж должен показать оценку A или B: это условие оценок 4 и 5.</w:t>
+        <w:t>В корне лежит .codeclimate.yml: пороги сложности методов, длины файла и вложенности, из анализа исключены deps, _build, node_modules, собранная статика и тесты. В README вставлен бейдж Code Climate репозитория Daniil9452/trello-clone. После того как публичный репозиторий добавлен в Code Climate, бейдж должен показать оценку A или B: это условие оценок 4 и 5.</w:t>
       </w:r>
     </w:p>
     <w:p>

</xml_diff>

<commit_message>
Add the Render deployment URL
Reviewers should open the published site, and the test account signs in there.
</commit_message>
<xml_diff>
--- a/docs/Отчет_практика_Trello_Clone.docx
+++ b/docs/Отчет_практика_Trello_Clone.docx
@@ -332,7 +332,7 @@
                 <w:color w:val="17324D"/>
                 <w:sz w:val="22"/>
               </w:rPr>
-              <w:t>Render, файл render.yaml. Ссылка вносится в README после создания сервиса.</w:t>
+              <w:t>https://doski-ixbr.onrender.com/sign-in</w:t>
             </w:r>
           </w:p>
         </w:tc>
@@ -1789,7 +1789,7 @@
           <w:color w:val="17324D"/>
           <w:sz w:val="28"/>
         </w:rPr>
-        <w:t>Экран указан путём приложения. Пока сайт не опубликован, тот же путь открывается локально: http://127.0.0.1:8080. После публикации к пути добавляется адрес из паспорта.</w:t>
+        <w:t>Экран открывается на опубликованном сайте https://doski-ixbr.onrender.com.</w:t>
       </w:r>
     </w:p>
     <w:tbl>
@@ -1906,7 +1906,7 @@
                 <w:color w:val="17324D"/>
                 <w:sz w:val="22"/>
               </w:rPr>
-              <w:t>http://127.0.0.1:8080/sign-up</w:t>
+              <w:t>https://doski-ixbr.onrender.com/sign-up</w:t>
             </w:r>
           </w:p>
         </w:tc>
@@ -1961,7 +1961,7 @@
                 <w:color w:val="17324D"/>
                 <w:sz w:val="22"/>
               </w:rPr>
-              <w:t>http://127.0.0.1:8080/sign-in</w:t>
+              <w:t>https://doski-ixbr.onrender.com/sign-in</w:t>
             </w:r>
           </w:p>
         </w:tc>
@@ -2016,7 +2016,7 @@
                 <w:color w:val="17324D"/>
                 <w:sz w:val="22"/>
               </w:rPr>
-              <w:t>http://127.0.0.1:8080/</w:t>
+              <w:t>https://doski-ixbr.onrender.com/</w:t>
             </w:r>
           </w:p>
         </w:tc>
@@ -2069,7 +2069,7 @@
                 <w:color w:val="17324D"/>
                 <w:sz w:val="22"/>
               </w:rPr>
-              <w:t>http://127.0.0.1:8080/</w:t>
+              <w:t>https://doski-ixbr.onrender.com/</w:t>
             </w:r>
           </w:p>
         </w:tc>
@@ -2124,7 +2124,7 @@
                 <w:color w:val="17324D"/>
                 <w:sz w:val="22"/>
               </w:rPr>
-              <w:t>http://127.0.0.1:8080/boards/:id</w:t>
+              <w:t>https://doski-ixbr.onrender.com/boards/:id</w:t>
             </w:r>
           </w:p>
         </w:tc>
@@ -2179,7 +2179,7 @@
                 <w:color w:val="17324D"/>
                 <w:sz w:val="22"/>
               </w:rPr>
-              <w:t>http://127.0.0.1:8080/boards/:id</w:t>
+              <w:t>https://doski-ixbr.onrender.com/boards/:id</w:t>
             </w:r>
           </w:p>
         </w:tc>
@@ -2232,7 +2232,7 @@
                 <w:color w:val="17324D"/>
                 <w:sz w:val="22"/>
               </w:rPr>
-              <w:t>http://127.0.0.1:8080/boards/:id</w:t>
+              <w:t>https://doski-ixbr.onrender.com/boards/:id</w:t>
             </w:r>
           </w:p>
         </w:tc>
@@ -2285,7 +2285,7 @@
                 <w:color w:val="17324D"/>
                 <w:sz w:val="22"/>
               </w:rPr>
-              <w:t>http://127.0.0.1:8080/boards/:id</w:t>
+              <w:t>https://doski-ixbr.onrender.com/boards/:id</w:t>
             </w:r>
           </w:p>
         </w:tc>
@@ -2338,7 +2338,7 @@
                 <w:color w:val="17324D"/>
                 <w:sz w:val="22"/>
               </w:rPr>
-              <w:t>http://127.0.0.1:8080/boards/:id</w:t>
+              <w:t>https://doski-ixbr.onrender.com/boards/:id</w:t>
             </w:r>
           </w:p>
         </w:tc>
@@ -2393,7 +2393,7 @@
                 <w:color w:val="17324D"/>
                 <w:sz w:val="22"/>
               </w:rPr>
-              <w:t>http://127.0.0.1:8080/boards/:id</w:t>
+              <w:t>https://doski-ixbr.onrender.com/boards/:id</w:t>
             </w:r>
           </w:p>
         </w:tc>
@@ -2446,7 +2446,7 @@
                 <w:color w:val="17324D"/>
                 <w:sz w:val="22"/>
               </w:rPr>
-              <w:t>http://127.0.0.1:8080/sign-in</w:t>
+              <w:t>https://doski-ixbr.onrender.com/sign-in</w:t>
             </w:r>
           </w:p>
         </w:tc>

</xml_diff>